<commit_message>
fix(docx): black headings, no HR lines, hide custom-style metadata
Co-authored-by: Cursor <cursoragent@cursor.com>
</commit_message>
<xml_diff>
--- a/docs/gost_reference.docx
+++ b/docs/gost_reference.docx
@@ -458,6 +458,7 @@
       <w:rFonts w:ascii="Times New Roman" w:hAnsi="Times New Roman"/>
       <w:b w:val="0"/>
       <w:i w:val="0"/>
+      <w:color w:val="000000"/>
       <w:sz w:val="28"/>
       <w:rFonts w:ascii="Times New Roman" w:hAnsi="Times New Roman" w:cs="Times New Roman" w:eastAsia="Times New Roman"/>
     </w:rPr>
@@ -528,7 +529,7 @@
       <w:bCs/>
       <w:i w:val="0"/>
       <w:caps/>
-      <w:color w:val="365F91" w:themeColor="accent1" w:themeShade="BF"/>
+      <w:color w:val="000000"/>
       <w:sz w:val="28"/>
       <w:szCs w:val="28"/>
       <w:rFonts w:ascii="Times New Roman" w:hAnsi="Times New Roman" w:cs="Times New Roman" w:eastAsia="Times New Roman"/>
@@ -556,7 +557,7 @@
       <w:b/>
       <w:bCs/>
       <w:i w:val="0"/>
-      <w:color w:val="4F81BD" w:themeColor="accent1"/>
+      <w:color w:val="000000"/>
       <w:sz w:val="28"/>
       <w:szCs w:val="26"/>
       <w:rFonts w:ascii="Times New Roman" w:hAnsi="Times New Roman" w:cs="Times New Roman" w:eastAsia="Times New Roman"/>
@@ -584,7 +585,7 @@
       <w:b/>
       <w:bCs/>
       <w:i w:val="0"/>
-      <w:color w:val="4F81BD" w:themeColor="accent1"/>
+      <w:color w:val="000000"/>
       <w:sz w:val="28"/>
       <w:rFonts w:ascii="Times New Roman" w:hAnsi="Times New Roman" w:cs="Times New Roman" w:eastAsia="Times New Roman"/>
     </w:rPr>
@@ -613,7 +614,7 @@
       <w:bCs/>
       <w:i w:val="0"/>
       <w:iCs/>
-      <w:color w:val="4F81BD" w:themeColor="accent1"/>
+      <w:color w:val="000000"/>
       <w:sz w:val="28"/>
       <w:rFonts w:ascii="Times New Roman" w:hAnsi="Times New Roman" w:cs="Times New Roman" w:eastAsia="Times New Roman"/>
     </w:rPr>
@@ -640,7 +641,7 @@
       <w:rFonts w:asciiTheme="majorHAnsi" w:eastAsiaTheme="majorEastAsia" w:hAnsiTheme="majorHAnsi" w:cstheme="majorBidi" w:ascii="Times New Roman" w:hAnsi="Times New Roman"/>
       <w:b w:val="0"/>
       <w:i/>
-      <w:color w:val="243F60" w:themeColor="accent1" w:themeShade="7F"/>
+      <w:color w:val="000000"/>
       <w:sz w:val="28"/>
       <w:rFonts w:ascii="Times New Roman" w:hAnsi="Times New Roman" w:cs="Times New Roman" w:eastAsia="Times New Roman"/>
     </w:rPr>
@@ -668,7 +669,7 @@
       <w:b w:val="0"/>
       <w:i/>
       <w:iCs/>
-      <w:color w:val="243F60" w:themeColor="accent1" w:themeShade="7F"/>
+      <w:color w:val="000000"/>
       <w:sz w:val="28"/>
       <w:rFonts w:ascii="Times New Roman" w:hAnsi="Times New Roman" w:cs="Times New Roman" w:eastAsia="Times New Roman"/>
     </w:rPr>
@@ -919,6 +920,7 @@
       <w:rFonts w:ascii="Times New Roman" w:hAnsi="Times New Roman"/>
       <w:b w:val="0"/>
       <w:i w:val="0"/>
+      <w:color w:val="000000"/>
       <w:sz w:val="28"/>
       <w:rFonts w:ascii="Times New Roman" w:hAnsi="Times New Roman" w:cs="Times New Roman" w:eastAsia="Times New Roman"/>
     </w:rPr>
@@ -12208,6 +12210,7 @@
       <w:b/>
       <w:i w:val="0"/>
       <w:caps/>
+      <w:color w:val="000000"/>
       <w:sz w:val="28"/>
       <w:rFonts w:ascii="Times New Roman" w:hAnsi="Times New Roman" w:cs="Times New Roman" w:eastAsia="Times New Roman"/>
     </w:rPr>
@@ -12224,6 +12227,7 @@
       <w:rFonts w:ascii="Times New Roman" w:hAnsi="Times New Roman"/>
       <w:b w:val="0"/>
       <w:i w:val="0"/>
+      <w:color w:val="000000"/>
       <w:sz w:val="28"/>
       <w:rFonts w:ascii="Times New Roman" w:hAnsi="Times New Roman" w:cs="Times New Roman" w:eastAsia="Times New Roman"/>
     </w:rPr>
@@ -12240,6 +12244,7 @@
       <w:rFonts w:ascii="Times New Roman" w:hAnsi="Times New Roman"/>
       <w:b/>
       <w:i w:val="0"/>
+      <w:color w:val="000000"/>
       <w:sz w:val="28"/>
       <w:rFonts w:ascii="Times New Roman" w:hAnsi="Times New Roman" w:cs="Times New Roman" w:eastAsia="Times New Roman"/>
     </w:rPr>
@@ -12256,6 +12261,7 @@
       <w:rFonts w:ascii="Times New Roman" w:hAnsi="Times New Roman"/>
       <w:b w:val="0"/>
       <w:i w:val="0"/>
+      <w:color w:val="000000"/>
       <w:sz w:val="28"/>
       <w:rFonts w:ascii="Times New Roman" w:hAnsi="Times New Roman" w:cs="Times New Roman" w:eastAsia="Times New Roman"/>
     </w:rPr>
@@ -12272,6 +12278,7 @@
       <w:rFonts w:ascii="Times New Roman" w:hAnsi="Times New Roman"/>
       <w:b w:val="0"/>
       <w:i/>
+      <w:color w:val="000000"/>
       <w:sz w:val="28"/>
       <w:rFonts w:ascii="Times New Roman" w:hAnsi="Times New Roman" w:cs="Times New Roman" w:eastAsia="Times New Roman"/>
     </w:rPr>
@@ -12288,6 +12295,7 @@
       <w:rFonts w:ascii="Times New Roman" w:hAnsi="Times New Roman"/>
       <w:b w:val="0"/>
       <w:i w:val="0"/>
+      <w:color w:val="000000"/>
       <w:sz w:val="28"/>
       <w:rFonts w:ascii="Times New Roman" w:hAnsi="Times New Roman" w:cs="Times New Roman" w:eastAsia="Times New Roman"/>
     </w:rPr>
@@ -12304,6 +12312,7 @@
       <w:rFonts w:ascii="Times New Roman" w:hAnsi="Times New Roman"/>
       <w:b w:val="0"/>
       <w:i w:val="0"/>
+      <w:color w:val="000000"/>
       <w:sz w:val="22"/>
       <w:rFonts w:ascii="Times New Roman" w:hAnsi="Times New Roman" w:cs="Times New Roman" w:eastAsia="Times New Roman"/>
     </w:rPr>
@@ -12321,6 +12330,7 @@
       <w:rFonts w:ascii="Times New Roman" w:hAnsi="Times New Roman"/>
       <w:b w:val="0"/>
       <w:i/>
+      <w:color w:val="000000"/>
       <w:sz w:val="24"/>
       <w:rFonts w:ascii="Times New Roman" w:hAnsi="Times New Roman" w:cs="Times New Roman" w:eastAsia="Times New Roman"/>
     </w:rPr>

</xml_diff>